<commit_message>
feat: persistencia local con Room según la guía y el ejemplo docente
- database/: BaseDeDatosKaiju (singleton obtenerInstancia) e InventarioDao.
- repository/InventarioRepository: clase que envuelve al DAO, único que lo conoce.
- viewmodel/InventarioViewModelFactory, usada por AppNavHost.
- Pruebas con FakeInventarioDao (como FakeEventoDao) y PersistenciaViewModelTest
  que simula reabrir la app; 40 pruebas aprobadas.
- Investigación §10 comentada en el código: @ForeignKey y migraciones (esquema).
- Guía de Room guardada como fuente; documentación y evidencia actualizadas.

Co-Authored-By: Claude Opus 5.5 <noreply@anthropic.com>
</commit_message>
<xml_diff>
--- a/docs/evidencia/evidencia-prototipo-kaiju-2026-10-14.docx
+++ b/docs/evidencia/evidencia-prototipo-kaiju-2026-10-14.docx
@@ -493,7 +493,7 @@
                 <w:sz w:val="19"/>
                 <w:szCs w:val="19"/>
               </w:rPr>
-              <w:t xml:space="preserve">commit 454fa57 (app) · documentación hasta 7e9ab17</w:t>
+              <w:t xml:space="preserve">rama main en GitHub (ver historial de commits)</w:t>
             </w:r>
           </w:p>
         </w:tc>
@@ -1512,7 +1512,7 @@
                 <w:sz w:val="19"/>
                 <w:szCs w:val="19"/>
               </w:rPr>
-              <w:t xml:space="preserve">14 commits en GitHub. Trabajo individual sin Trello: forma de evidencia por confirmar con el docente.</w:t>
+              <w:t xml:space="preserve">Commits frecuentes en GitHub. Trabajo individual sin Trello: forma de evidencia por confirmar con el docente.</w:t>
             </w:r>
           </w:p>
         </w:tc>
@@ -2854,7 +2854,7 @@
                 <w:sz w:val="19"/>
                 <w:szCs w:val="19"/>
               </w:rPr>
-              <w:t xml:space="preserve">Hecho con Room</w:t>
+              <w:t xml:space="preserve">Hecho con Room (Entity, DAO, Database, Repository y Factory)</w:t>
             </w:r>
           </w:p>
         </w:tc>
@@ -5613,7 +5613,7 @@
                 <w:sz w:val="19"/>
                 <w:szCs w:val="19"/>
               </w:rPr>
-              <w:t xml:space="preserve">38 pruebas aprobadas, 0 fallos</w:t>
+              <w:t xml:space="preserve">40 pruebas aprobadas, 0 fallos</w:t>
             </w:r>
           </w:p>
         </w:tc>
@@ -6042,7 +6042,7 @@
                 <w:sz w:val="19"/>
                 <w:szCs w:val="19"/>
               </w:rPr>
-              <w:t xml:space="preserve">SesionViewModelTest (4)</w:t>
+              <w:t xml:space="preserve">PersistenciaViewModelTest (2)</w:t>
             </w:r>
           </w:p>
         </w:tc>
@@ -6072,7 +6072,7 @@
                 <w:sz w:val="19"/>
                 <w:szCs w:val="19"/>
               </w:rPr>
-              <w:t xml:space="preserve">Selección de usuario, error sin selección y cambio de usuario.</w:t>
+              <w:t xml:space="preserve">Reabrir la app: lo guardado sigue y los datos de prueba no pisan lo existente (como el test del ejemplo de la Agenda).</w:t>
             </w:r>
           </w:p>
         </w:tc>
@@ -6104,6 +6104,68 @@
                 <w:sz w:val="19"/>
                 <w:szCs w:val="19"/>
               </w:rPr>
+              <w:t xml:space="preserve">SesionViewModelTest (4)</w:t>
+            </w:r>
+          </w:p>
+        </w:tc>
+        <w:tc>
+          <w:tcPr>
+            <w:tcW w:type="dxa" w:w="6160"/>
+            <w:tcBorders>
+              <w:top w:val="single" w:color="BFBFBF" w:sz="4"/>
+              <w:left w:val="single" w:color="BFBFBF" w:sz="4"/>
+              <w:bottom w:val="single" w:color="BFBFBF" w:sz="4"/>
+              <w:right w:val="single" w:color="BFBFBF" w:sz="4"/>
+            </w:tcBorders>
+            <w:shd w:fill="F2F2F2" w:color="auto" w:val="clear"/>
+            <w:tcMar>
+              <w:top w:type="dxa" w:w="60"/>
+              <w:left w:type="dxa" w:w="100"/>
+              <w:bottom w:type="dxa" w:w="60"/>
+              <w:right w:type="dxa" w:w="100"/>
+            </w:tcMar>
+          </w:tcPr>
+          <w:p>
+            <w:r>
+              <w:rPr>
+                <w:b w:val="false"/>
+                <w:bCs w:val="false"/>
+                <w:color w:val="000000"/>
+                <w:sz w:val="19"/>
+                <w:szCs w:val="19"/>
+              </w:rPr>
+              <w:t xml:space="preserve">Selección de usuario, error sin selección y cambio de usuario.</w:t>
+            </w:r>
+          </w:p>
+        </w:tc>
+      </w:tr>
+      <w:tr>
+        <w:tc>
+          <w:tcPr>
+            <w:tcW w:type="dxa" w:w="3200"/>
+            <w:tcBorders>
+              <w:top w:val="single" w:color="BFBFBF" w:sz="4"/>
+              <w:left w:val="single" w:color="BFBFBF" w:sz="4"/>
+              <w:bottom w:val="single" w:color="BFBFBF" w:sz="4"/>
+              <w:right w:val="single" w:color="BFBFBF" w:sz="4"/>
+            </w:tcBorders>
+            <w:shd w:fill="FFFFFF" w:color="auto" w:val="clear"/>
+            <w:tcMar>
+              <w:top w:type="dxa" w:w="60"/>
+              <w:left w:type="dxa" w:w="100"/>
+              <w:bottom w:type="dxa" w:w="60"/>
+              <w:right w:type="dxa" w:w="100"/>
+            </w:tcMar>
+          </w:tcPr>
+          <w:p>
+            <w:r>
+              <w:rPr>
+                <w:b w:val="false"/>
+                <w:bCs w:val="false"/>
+                <w:color w:val="000000"/>
+                <w:sz w:val="19"/>
+                <w:szCs w:val="19"/>
+              </w:rPr>
               <w:t xml:space="preserve">InventarioDaoTest (3, en teléfono)</w:t>
             </w:r>
           </w:p>
@@ -6117,7 +6179,7 @@
               <w:bottom w:val="single" w:color="BFBFBF" w:sz="4"/>
               <w:right w:val="single" w:color="BFBFBF" w:sz="4"/>
             </w:tcBorders>
-            <w:shd w:fill="F2F2F2" w:color="auto" w:val="clear"/>
+            <w:shd w:fill="FFFFFF" w:color="auto" w:val="clear"/>
             <w:tcMar>
               <w:top w:type="dxa" w:w="60"/>
               <w:left w:type="dxa" w:w="100"/>
@@ -6743,7 +6805,7 @@
                 <w:sz w:val="19"/>
                 <w:szCs w:val="19"/>
               </w:rPr>
-              <w:t xml:space="preserve">Capas separadas y Room detrás del repositorio</w:t>
+              <w:t xml:space="preserve">Capas separadas; Room con database/, InventarioRepository e InventarioViewModelFactory, como la Guía de Room</w:t>
             </w:r>
           </w:p>
         </w:tc>
@@ -6835,7 +6897,7 @@
                 <w:sz w:val="19"/>
                 <w:szCs w:val="19"/>
               </w:rPr>
-              <w:t xml:space="preserve">GitHub con 14 commits; sin Trello (trabajo individual, por confirmar)</w:t>
+              <w:t xml:space="preserve">GitHub con commits frecuentes; sin Trello (trabajo individual, por confirmar)</w:t>
             </w:r>
           </w:p>
         </w:tc>
@@ -8337,6 +8399,190 @@
                 <w:szCs w:val="19"/>
               </w:rPr>
               <w:t xml:space="preserve">docs: completar plantilla de requerimientos con estado del prototipo</w:t>
+            </w:r>
+          </w:p>
+        </w:tc>
+      </w:tr>
+      <w:tr>
+        <w:tc>
+          <w:tcPr>
+            <w:tcW w:type="dxa" w:w="1100"/>
+            <w:tcBorders>
+              <w:top w:val="single" w:color="BFBFBF" w:sz="4"/>
+              <w:left w:val="single" w:color="BFBFBF" w:sz="4"/>
+              <w:bottom w:val="single" w:color="BFBFBF" w:sz="4"/>
+              <w:right w:val="single" w:color="BFBFBF" w:sz="4"/>
+            </w:tcBorders>
+            <w:shd w:fill="FFFFFF" w:color="auto" w:val="clear"/>
+            <w:tcMar>
+              <w:top w:type="dxa" w:w="60"/>
+              <w:left w:type="dxa" w:w="100"/>
+              <w:bottom w:type="dxa" w:w="60"/>
+              <w:right w:type="dxa" w:w="100"/>
+            </w:tcMar>
+          </w:tcPr>
+          <w:p>
+            <w:r>
+              <w:rPr>
+                <w:b w:val="false"/>
+                <w:bCs w:val="false"/>
+                <w:color w:val="000000"/>
+                <w:sz w:val="19"/>
+                <w:szCs w:val="19"/>
+              </w:rPr>
+              <w:t xml:space="preserve">f743187</w:t>
+            </w:r>
+          </w:p>
+        </w:tc>
+        <w:tc>
+          <w:tcPr>
+            <w:tcW w:type="dxa" w:w="1400"/>
+            <w:tcBorders>
+              <w:top w:val="single" w:color="BFBFBF" w:sz="4"/>
+              <w:left w:val="single" w:color="BFBFBF" w:sz="4"/>
+              <w:bottom w:val="single" w:color="BFBFBF" w:sz="4"/>
+              <w:right w:val="single" w:color="BFBFBF" w:sz="4"/>
+            </w:tcBorders>
+            <w:shd w:fill="FFFFFF" w:color="auto" w:val="clear"/>
+            <w:tcMar>
+              <w:top w:type="dxa" w:w="60"/>
+              <w:left w:type="dxa" w:w="100"/>
+              <w:bottom w:type="dxa" w:w="60"/>
+              <w:right w:type="dxa" w:w="100"/>
+            </w:tcMar>
+          </w:tcPr>
+          <w:p>
+            <w:r>
+              <w:rPr>
+                <w:b w:val="false"/>
+                <w:bCs w:val="false"/>
+                <w:color w:val="000000"/>
+                <w:sz w:val="19"/>
+                <w:szCs w:val="19"/>
+              </w:rPr>
+              <w:t xml:space="preserve">14-10-2026</w:t>
+            </w:r>
+          </w:p>
+        </w:tc>
+        <w:tc>
+          <w:tcPr>
+            <w:tcW w:type="dxa" w:w="6860"/>
+            <w:tcBorders>
+              <w:top w:val="single" w:color="BFBFBF" w:sz="4"/>
+              <w:left w:val="single" w:color="BFBFBF" w:sz="4"/>
+              <w:bottom w:val="single" w:color="BFBFBF" w:sz="4"/>
+              <w:right w:val="single" w:color="BFBFBF" w:sz="4"/>
+            </w:tcBorders>
+            <w:shd w:fill="FFFFFF" w:color="auto" w:val="clear"/>
+            <w:tcMar>
+              <w:top w:type="dxa" w:w="60"/>
+              <w:left w:type="dxa" w:w="100"/>
+              <w:bottom w:type="dxa" w:w="60"/>
+              <w:right w:type="dxa" w:w="100"/>
+            </w:tcMar>
+          </w:tcPr>
+          <w:p>
+            <w:r>
+              <w:rPr>
+                <w:b w:val="false"/>
+                <w:bCs w:val="false"/>
+                <w:color w:val="000000"/>
+                <w:sz w:val="19"/>
+                <w:szCs w:val="19"/>
+              </w:rPr>
+              <w:t xml:space="preserve">docs: agregar documento de evidencia de avance en Word</w:t>
+            </w:r>
+          </w:p>
+        </w:tc>
+      </w:tr>
+      <w:tr>
+        <w:tc>
+          <w:tcPr>
+            <w:tcW w:type="dxa" w:w="1100"/>
+            <w:tcBorders>
+              <w:top w:val="single" w:color="BFBFBF" w:sz="4"/>
+              <w:left w:val="single" w:color="BFBFBF" w:sz="4"/>
+              <w:bottom w:val="single" w:color="BFBFBF" w:sz="4"/>
+              <w:right w:val="single" w:color="BFBFBF" w:sz="4"/>
+            </w:tcBorders>
+            <w:shd w:fill="F2F2F2" w:color="auto" w:val="clear"/>
+            <w:tcMar>
+              <w:top w:type="dxa" w:w="60"/>
+              <w:left w:type="dxa" w:w="100"/>
+              <w:bottom w:type="dxa" w:w="60"/>
+              <w:right w:type="dxa" w:w="100"/>
+            </w:tcMar>
+          </w:tcPr>
+          <w:p>
+            <w:r>
+              <w:rPr>
+                <w:b w:val="false"/>
+                <w:bCs w:val="false"/>
+                <w:color w:val="000000"/>
+                <w:sz w:val="19"/>
+                <w:szCs w:val="19"/>
+              </w:rPr>
+              <w:t xml:space="preserve">45fe467</w:t>
+            </w:r>
+          </w:p>
+        </w:tc>
+        <w:tc>
+          <w:tcPr>
+            <w:tcW w:type="dxa" w:w="1400"/>
+            <w:tcBorders>
+              <w:top w:val="single" w:color="BFBFBF" w:sz="4"/>
+              <w:left w:val="single" w:color="BFBFBF" w:sz="4"/>
+              <w:bottom w:val="single" w:color="BFBFBF" w:sz="4"/>
+              <w:right w:val="single" w:color="BFBFBF" w:sz="4"/>
+            </w:tcBorders>
+            <w:shd w:fill="F2F2F2" w:color="auto" w:val="clear"/>
+            <w:tcMar>
+              <w:top w:type="dxa" w:w="60"/>
+              <w:left w:type="dxa" w:w="100"/>
+              <w:bottom w:type="dxa" w:w="60"/>
+              <w:right w:type="dxa" w:w="100"/>
+            </w:tcMar>
+          </w:tcPr>
+          <w:p>
+            <w:r>
+              <w:rPr>
+                <w:b w:val="false"/>
+                <w:bCs w:val="false"/>
+                <w:color w:val="000000"/>
+                <w:sz w:val="19"/>
+                <w:szCs w:val="19"/>
+              </w:rPr>
+              <w:t xml:space="preserve">14-10-2026</w:t>
+            </w:r>
+          </w:p>
+        </w:tc>
+        <w:tc>
+          <w:tcPr>
+            <w:tcW w:type="dxa" w:w="6860"/>
+            <w:tcBorders>
+              <w:top w:val="single" w:color="BFBFBF" w:sz="4"/>
+              <w:left w:val="single" w:color="BFBFBF" w:sz="4"/>
+              <w:bottom w:val="single" w:color="BFBFBF" w:sz="4"/>
+              <w:right w:val="single" w:color="BFBFBF" w:sz="4"/>
+            </w:tcBorders>
+            <w:shd w:fill="F2F2F2" w:color="auto" w:val="clear"/>
+            <w:tcMar>
+              <w:top w:type="dxa" w:w="60"/>
+              <w:left w:type="dxa" w:w="100"/>
+              <w:bottom w:type="dxa" w:w="60"/>
+              <w:right w:type="dxa" w:w="100"/>
+            </w:tcMar>
+          </w:tcPr>
+          <w:p>
+            <w:r>
+              <w:rPr>
+                <w:b w:val="false"/>
+                <w:bCs w:val="false"/>
+                <w:color w:val="000000"/>
+                <w:sz w:val="19"/>
+                <w:szCs w:val="19"/>
+              </w:rPr>
+              <w:t xml:space="preserve">chore: reducir memoria de compilación y preparar demostración</w:t>
             </w:r>
           </w:p>
         </w:tc>

</xml_diff>

<commit_message>
docs: escribir sección en vez de § y ordenar evidencia del código
- Se reemplaza el símbolo § por la palabra sección en código, documentos y plantilla (las fuentes originales no se modifican).
- En el código y la documentación vigente se usan nombres legibles (Guía 10, Guía 11, caso) en vez de códigos internos.
- docs/evidencia/CODIGO.md: cada archivo por capa, con su propósito, requisito y prueba.
- Word de evidencia regenerado. 40 pruebas aprobadas.

Co-Authored-By: Claude Opus 5.5 <noreply@anthropic.com>
</commit_message>
<xml_diff>
--- a/docs/evidencia/evidencia-prototipo-kaiju-2026-10-14.docx
+++ b/docs/evidencia/evidencia-prototipo-kaiju-2026-10-14.docx
@@ -536,7 +536,7 @@
         <w:spacing w:after="120"/>
       </w:pPr>
       <w:r>
-        <w:t xml:space="preserve">Kaiju necesita mejorar el control y la trazabilidad de su inventario: saber cuánto hay de cada producto, registrar cada entrada y salida, y detectar a tiempo qué hay que reponer (caso C-01 §2.3 y §2.4).</w:t>
+        <w:t xml:space="preserve">Kaiju necesita mejorar el control y la trazabilidad de su inventario: saber cuánto hay de cada producto, registrar cada entrada y salida, y detectar a tiempo qué hay que reponer (caso caso sección 2.3 y sección 2.4).</w:t>
       </w:r>
     </w:p>
     <w:p>
@@ -566,7 +566,7 @@
         <w:t xml:space="preserve">Fuentes: </w:t>
       </w:r>
       <w:r>
-        <w:t xml:space="preserve">C-01 caso Kaiju; A-10 Guía 10 (RF-01 a RF-10, RN-01 a RN-06, B-01 a B-09); A-11 Guía 11 (recursos nativos y permisos); plantilla de requerimientos; guía extra; Cuestionario IEEE 830.</w:t>
+        <w:t xml:space="preserve">caso caso Kaiju; Guía 10 Guía 10 (RF-01 a RF-10, RN-01 a RN-06, B-01 a B-09); Guía 11 Guía 11 (recursos nativos y permisos); plantilla de requerimientos; guía extra; Cuestionario IEEE 830.</w:t>
       </w:r>
     </w:p>
     <w:p>
@@ -574,7 +574,7 @@
         <w:pStyle w:val="Heading1"/>
       </w:pPr>
       <w:r>
-        <w:t xml:space="preserve">2. Revisión de la base (Guía 10 §8)</w:t>
+        <w:t xml:space="preserve">2. Revisión de la base (Guía 10 sección 8)</w:t>
       </w:r>
     </w:p>
     <w:tbl>
@@ -838,7 +838,7 @@
                 <w:sz w:val="19"/>
                 <w:szCs w:val="19"/>
               </w:rPr>
-              <w:t xml:space="preserve">Carpetas y archivos de §3</w:t>
+              <w:t xml:space="preserve">Carpetas y archivos de sección 3</w:t>
             </w:r>
           </w:p>
         </w:tc>
@@ -960,7 +960,7 @@
                 <w:sz w:val="19"/>
                 <w:szCs w:val="19"/>
               </w:rPr>
-              <w:t xml:space="preserve">Completo, con los campos de A-10 §4.</w:t>
+              <w:t xml:space="preserve">Completo, con los campos de Guía 10 sección 4.</w:t>
             </w:r>
           </w:p>
         </w:tc>
@@ -1390,7 +1390,7 @@
                 <w:sz w:val="19"/>
                 <w:szCs w:val="19"/>
               </w:rPr>
-              <w:t xml:space="preserve">README con equipo, descripción y decisiones §6</w:t>
+              <w:t xml:space="preserve">README con equipo, descripción y decisiones sección 6</w:t>
             </w:r>
           </w:p>
         </w:tc>
@@ -1523,7 +1523,7 @@
         <w:pStyle w:val="Heading1"/>
       </w:pPr>
       <w:r>
-        <w:t xml:space="preserve">3. Requerimientos funcionales (Guía 10 §1)</w:t>
+        <w:t xml:space="preserve">3. Requerimientos funcionales (Guía 10 sección 1)</w:t>
       </w:r>
     </w:p>
     <w:tbl>
@@ -3573,7 +3573,7 @@
         <w:spacing w:after="120"/>
       </w:pPr>
       <w:r>
-        <w:t xml:space="preserve">Todas las reglas se revisan en el ViewModel antes de llamar al repositorio, como pide A-10 §3. Las pantallas solo muestran el estado.</w:t>
+        <w:t xml:space="preserve">Todas las reglas se revisan en el ViewModel antes de llamar al repositorio, como pide Guía 10 sección 3. Las pantallas solo muestran el estado.</w:t>
       </w:r>
     </w:p>
     <w:p>
@@ -3581,7 +3581,7 @@
         <w:pStyle w:val="Heading1"/>
       </w:pPr>
       <w:r>
-        <w:t xml:space="preserve">4. Recursos nativos y permisos (Guía 11 §9)</w:t>
+        <w:t xml:space="preserve">4. Recursos nativos y permisos (Guía 11 sección 9)</w:t>
       </w:r>
     </w:p>
     <w:p>
@@ -3793,7 +3793,7 @@
                 <w:sz w:val="19"/>
                 <w:szCs w:val="19"/>
               </w:rPr>
-              <w:t xml:space="preserve">Inventario y administrador necesitan enterarse cuando un producto queda bajo su mínimo (C-01 §3.3)</w:t>
+              <w:t xml:space="preserve">Inventario y administrador necesitan enterarse cuando un producto queda bajo su mínimo (caso sección 3.3)</w:t>
             </w:r>
           </w:p>
         </w:tc>
@@ -3945,7 +3945,7 @@
                 <w:sz w:val="19"/>
                 <w:szCs w:val="19"/>
               </w:rPr>
-              <w:t xml:space="preserve">Quien registra un movimiento necesita elegir el producto rápido y sin errores (C-01 §3.3)</w:t>
+              <w:t xml:space="preserve">Quien registra un movimiento necesita elegir el producto rápido y sin errores (caso sección 3.3)</w:t>
             </w:r>
           </w:p>
         </w:tc>
@@ -4591,7 +4591,7 @@
                 <w:sz w:val="19"/>
                 <w:szCs w:val="19"/>
               </w:rPr>
-              <w:t xml:space="preserve">Dos investigaciones aplicadas (§10)</w:t>
+              <w:t xml:space="preserve">Dos investigaciones aplicadas (sección 10)</w:t>
             </w:r>
           </w:p>
         </w:tc>
@@ -5356,7 +5356,7 @@
         <w:pStyle w:val="Heading1"/>
       </w:pPr>
       <w:r>
-        <w:t xml:space="preserve">5. Animaciones e identidad visual (Guía 10 §6)</w:t>
+        <w:t xml:space="preserve">5. Animaciones e identidad visual (Guía 10 sección 6)</w:t>
       </w:r>
     </w:p>
     <w:p>
@@ -5456,7 +5456,7 @@
         <w:t xml:space="preserve">Módulo propio: </w:t>
       </w:r>
       <w:r>
-        <w:t xml:space="preserve">pendiente. Más/menos vendidos o tendencias (C-01 §4.1) requieren que el cliente defina medida y período; la Guía 10 §9 permite recortarlo antes que la base.</w:t>
+        <w:t xml:space="preserve">pendiente. Más/menos vendidos o tendencias (caso sección 4.1) requieren que el cliente defina medida y período; la Guía 10 sección 9 permite recortarlo antes que la base.</w:t>
       </w:r>
     </w:p>
     <w:p>
@@ -6235,7 +6235,7 @@
         <w:spacing w:after="120"/>
       </w:pPr>
       <w:r>
-        <w:t xml:space="preserve">Cobertura según la rúbrica de A-10 §9. No es una nota.</w:t>
+        <w:t xml:space="preserve">Cobertura según la rúbrica de Guía 10 sección 9. No es una nota.</w:t>
       </w:r>
     </w:p>
     <w:tbl>

</xml_diff>

<commit_message>
feat: alta de producto con entrada inicial y ajuste por conteo físico
- Alta (RF-05): el producto nace con 0 unidades, como en SAP y Odoo; sus
  existencias entran con una Entrada. El Snackbar ofrece "Registrar
  entrada", que abre Movimiento con el producto y el tipo elegidos.
- Ajuste (RF-08, RN-04): se ingresa la cantidad contada (0 o más, distinta
  del disponible); la app muestra la diferencia y pide confirmar. Al
  confirmar, el stock pasa a lo contado y se guarda la diferencia con signo.
- Historial muestra el signo real de cada ajuste.
- Corrige el menú inferior: "Catálogo" restauraba Detalle y Movimiento en
  vez de volver al catálogo (saveState/restoreState).
- 45 pruebas unitarias (7 nuevas de alta y ajuste).
</commit_message>
<xml_diff>
--- a/docs/evidencia/evidencia-prototipo-kaiju-2026-10-14.docx
+++ b/docs/evidencia/evidencia-prototipo-kaiju-2026-10-14.docx
@@ -536,7 +536,7 @@
         <w:spacing w:after="120"/>
       </w:pPr>
       <w:r>
-        <w:t xml:space="preserve">Kaiju necesita mejorar el control y la trazabilidad de su inventario: saber cuánto hay de cada producto, registrar cada entrada y salida, y detectar a tiempo qué hay que reponer (caso C-01 §2.3 y §2.4).</w:t>
+        <w:t xml:space="preserve">Kaiju necesita mejorar el control y la trazabilidad de su inventario: saber cuánto hay de cada producto, registrar cada entrada y salida, y detectar a tiempo qué hay que reponer (caso caso sección 2.3 y sección 2.4).</w:t>
       </w:r>
     </w:p>
     <w:p>
@@ -566,7 +566,7 @@
         <w:t xml:space="preserve">Fuentes: </w:t>
       </w:r>
       <w:r>
-        <w:t xml:space="preserve">C-01 caso Kaiju; A-10 Guía 10 (RF-01 a RF-10, RN-01 a RN-06, B-01 a B-09); A-11 Guía 11 (recursos nativos y permisos); plantilla de requerimientos; guía extra; Cuestionario IEEE 830.</w:t>
+        <w:t xml:space="preserve">caso caso Kaiju; Guía 10 Guía 10 (RF-01 a RF-10, RN-01 a RN-06, B-01 a B-09); Guía 11 Guía 11 (recursos nativos y permisos); plantilla de requerimientos; guía extra; Cuestionario IEEE 830.</w:t>
       </w:r>
     </w:p>
     <w:p>
@@ -574,7 +574,7 @@
         <w:pStyle w:val="Heading1"/>
       </w:pPr>
       <w:r>
-        <w:t xml:space="preserve">2. Revisión de la base (Guía 10 §8)</w:t>
+        <w:t xml:space="preserve">2. Revisión de la base (Guía 10 sección 8)</w:t>
       </w:r>
     </w:p>
     <w:tbl>
@@ -838,7 +838,7 @@
                 <w:sz w:val="19"/>
                 <w:szCs w:val="19"/>
               </w:rPr>
-              <w:t xml:space="preserve">Carpetas y archivos de §3</w:t>
+              <w:t xml:space="preserve">Carpetas y archivos de sección 3</w:t>
             </w:r>
           </w:p>
         </w:tc>
@@ -960,7 +960,7 @@
                 <w:sz w:val="19"/>
                 <w:szCs w:val="19"/>
               </w:rPr>
-              <w:t xml:space="preserve">Completo, con los campos de A-10 §4.</w:t>
+              <w:t xml:space="preserve">Completo, con los campos de Guía 10 sección 4.</w:t>
             </w:r>
           </w:p>
         </w:tc>
@@ -1390,7 +1390,7 @@
                 <w:sz w:val="19"/>
                 <w:szCs w:val="19"/>
               </w:rPr>
-              <w:t xml:space="preserve">README con equipo, descripción y decisiones §6</w:t>
+              <w:t xml:space="preserve">README con equipo, descripción y decisiones sección 6</w:t>
             </w:r>
           </w:p>
         </w:tc>
@@ -1523,7 +1523,7 @@
         <w:pStyle w:val="Heading1"/>
       </w:pPr>
       <w:r>
-        <w:t xml:space="preserve">3. Requerimientos funcionales (Guía 10 §1)</w:t>
+        <w:t xml:space="preserve">3. Requerimientos funcionales (Guía 10 sección 1)</w:t>
       </w:r>
     </w:p>
     <w:tbl>
@@ -3573,7 +3573,7 @@
         <w:spacing w:after="120"/>
       </w:pPr>
       <w:r>
-        <w:t xml:space="preserve">Todas las reglas se revisan en el ViewModel antes de llamar al repositorio, como pide A-10 §3. Las pantallas solo muestran el estado.</w:t>
+        <w:t xml:space="preserve">Todas las reglas se revisan en el ViewModel antes de llamar al repositorio, como pide Guía 10 sección 3. Las pantallas solo muestran el estado.</w:t>
       </w:r>
     </w:p>
     <w:p>
@@ -3581,7 +3581,7 @@
         <w:pStyle w:val="Heading1"/>
       </w:pPr>
       <w:r>
-        <w:t xml:space="preserve">4. Recursos nativos y permisos (Guía 11 §9)</w:t>
+        <w:t xml:space="preserve">4. Recursos nativos y permisos (Guía 11 sección 9)</w:t>
       </w:r>
     </w:p>
     <w:p>
@@ -3793,7 +3793,7 @@
                 <w:sz w:val="19"/>
                 <w:szCs w:val="19"/>
               </w:rPr>
-              <w:t xml:space="preserve">Inventario y administrador necesitan enterarse cuando un producto queda bajo su mínimo (C-01 §3.3)</w:t>
+              <w:t xml:space="preserve">Inventario y administrador necesitan enterarse cuando un producto queda bajo su mínimo (caso sección 3.3)</w:t>
             </w:r>
           </w:p>
         </w:tc>
@@ -3945,7 +3945,7 @@
                 <w:sz w:val="19"/>
                 <w:szCs w:val="19"/>
               </w:rPr>
-              <w:t xml:space="preserve">Quien registra un movimiento necesita elegir el producto rápido y sin errores (C-01 §3.3)</w:t>
+              <w:t xml:space="preserve">Quien registra un movimiento necesita elegir el producto rápido y sin errores (caso sección 3.3)</w:t>
             </w:r>
           </w:p>
         </w:tc>
@@ -4591,7 +4591,7 @@
                 <w:sz w:val="19"/>
                 <w:szCs w:val="19"/>
               </w:rPr>
-              <w:t xml:space="preserve">Dos investigaciones aplicadas (§10)</w:t>
+              <w:t xml:space="preserve">Dos investigaciones aplicadas (sección 10)</w:t>
             </w:r>
           </w:p>
         </w:tc>
@@ -5356,7 +5356,7 @@
         <w:pStyle w:val="Heading1"/>
       </w:pPr>
       <w:r>
-        <w:t xml:space="preserve">5. Animaciones e identidad visual (Guía 10 §6)</w:t>
+        <w:t xml:space="preserve">5. Animaciones e identidad visual (Guía 10 sección 6)</w:t>
       </w:r>
     </w:p>
     <w:p>
@@ -5456,7 +5456,7 @@
         <w:t xml:space="preserve">Módulo propio: </w:t>
       </w:r>
       <w:r>
-        <w:t xml:space="preserve">pendiente. Más/menos vendidos o tendencias (C-01 §4.1) requieren que el cliente defina medida y período; la Guía 10 §9 permite recortarlo antes que la base.</w:t>
+        <w:t xml:space="preserve">pendiente. Más/menos vendidos o tendencias (caso sección 4.1) requieren que el cliente defina medida y período; la Guía 10 sección 9 permite recortarlo antes que la base.</w:t>
       </w:r>
     </w:p>
     <w:p>
@@ -6235,7 +6235,7 @@
         <w:spacing w:after="120"/>
       </w:pPr>
       <w:r>
-        <w:t xml:space="preserve">Cobertura según la rúbrica de A-10 §9. No es una nota.</w:t>
+        <w:t xml:space="preserve">Cobertura según la rúbrica de Guía 10 sección 9. No es una nota.</w:t>
       </w:r>
     </w:p>
     <w:tbl>

</xml_diff>